<commit_message>
Update Inter 1 Test 3 Reinforcement: tighter spacing, add which/that to relative clauses
</commit_message>
<xml_diff>
--- a/Inter1_Test3_Reinforcement.docx
+++ b/Inter1_Test3_Reinforcement.docx
@@ -37,7 +37,7 @@
           </w:tcPr>
           <w:p>
             <w:pPr>
-              <w:spacing w:after="40" w:before="0"/>
+              <w:spacing w:after="0" w:before="0"/>
               <w:jc w:val="center"/>
             </w:pPr>
             <w:r>
@@ -54,7 +54,7 @@
           </w:p>
           <w:p>
             <w:pPr>
-              <w:spacing w:after="40" w:before="0"/>
+              <w:spacing w:after="0" w:before="0"/>
               <w:jc w:val="center"/>
             </w:pPr>
             <w:r>
@@ -89,7 +89,7 @@
     </w:tbl>
     <w:p>
       <w:pPr>
-        <w:spacing w:after="80" w:before="60"/>
+        <w:spacing w:after="0" w:before="0"/>
       </w:pPr>
       <w:r>
         <w:rPr>
@@ -151,7 +151,7 @@
         <w:pBdr>
           <w:bottom w:val="single" w:color="1F3A5F" w:sz="8" w:space="4"/>
         </w:pBdr>
-        <w:spacing w:after="20" w:before="80"/>
+        <w:spacing w:after="10" w:before="60"/>
       </w:pPr>
       <w:r>
         <w:rPr>
@@ -200,7 +200,7 @@
           </w:tcPr>
           <w:p>
             <w:pPr>
-              <w:spacing w:after="20" w:before="20"/>
+              <w:spacing w:after="0" w:before="0"/>
             </w:pPr>
             <w:r>
               <w:rPr>
@@ -224,7 +224,7 @@
           </w:p>
           <w:p>
             <w:pPr>
-              <w:spacing w:after="20" w:before="20"/>
+              <w:spacing w:after="0" w:before="0"/>
             </w:pPr>
             <w:r>
               <w:rPr>
@@ -283,7 +283,7 @@
           </w:p>
           <w:p>
             <w:pPr>
-              <w:spacing w:after="20" w:before="20"/>
+              <w:spacing w:after="0" w:before="0"/>
             </w:pPr>
             <w:r>
               <w:rPr>
@@ -296,7 +296,7 @@
           </w:p>
           <w:p>
             <w:pPr>
-              <w:spacing w:after="20" w:before="20"/>
+              <w:spacing w:after="0" w:before="0"/>
             </w:pPr>
             <w:r>
               <w:rPr>
@@ -320,7 +320,7 @@
           </w:p>
           <w:p>
             <w:pPr>
-              <w:spacing w:after="20" w:before="20"/>
+              <w:spacing w:after="0" w:before="0"/>
             </w:pPr>
             <w:r>
               <w:rPr>
@@ -357,7 +357,7 @@
           </w:p>
           <w:p>
             <w:pPr>
-              <w:spacing w:after="20" w:before="20"/>
+              <w:spacing w:after="0" w:before="0"/>
             </w:pPr>
             <w:r>
               <w:rPr>
@@ -370,7 +370,7 @@
           </w:p>
           <w:p>
             <w:pPr>
-              <w:spacing w:after="20" w:before="20"/>
+              <w:spacing w:after="0" w:before="0"/>
             </w:pPr>
             <w:r>
               <w:rPr>
@@ -394,7 +394,7 @@
           </w:p>
           <w:p>
             <w:pPr>
-              <w:spacing w:after="20" w:before="20"/>
+              <w:spacing w:after="0" w:before="0"/>
             </w:pPr>
             <w:r>
               <w:rPr>
@@ -453,7 +453,7 @@
           </w:p>
           <w:p>
             <w:pPr>
-              <w:spacing w:after="20" w:before="20"/>
+              <w:spacing w:after="0" w:before="0"/>
             </w:pPr>
             <w:r>
               <w:rPr>
@@ -466,7 +466,7 @@
           </w:p>
           <w:p>
             <w:pPr>
-              <w:spacing w:after="20" w:before="20"/>
+              <w:spacing w:after="0" w:before="0"/>
             </w:pPr>
             <w:r>
               <w:rPr>
@@ -490,7 +490,7 @@
           </w:p>
           <w:p>
             <w:pPr>
-              <w:spacing w:after="20" w:before="20"/>
+              <w:spacing w:after="0" w:before="0"/>
             </w:pPr>
             <w:r>
               <w:rPr>
@@ -530,7 +530,7 @@
     </w:tbl>
     <w:p>
       <w:pPr>
-        <w:spacing w:after="20" w:before="60"/>
+        <w:spacing w:after="0" w:before="0"/>
       </w:pPr>
       <w:r>
         <w:rPr>
@@ -554,7 +554,7 @@
     </w:p>
     <w:p>
       <w:pPr>
-        <w:spacing w:after="40" w:before="60"/>
+        <w:spacing w:after="0" w:before="0"/>
         <w:ind w:left="360"/>
       </w:pPr>
       <w:r>
@@ -589,7 +589,7 @@
     </w:p>
     <w:p>
       <w:pPr>
-        <w:spacing w:after="40" w:before="60"/>
+        <w:spacing w:after="0" w:before="0"/>
         <w:ind w:left="360"/>
       </w:pPr>
       <w:r>
@@ -624,7 +624,7 @@
     </w:p>
     <w:p>
       <w:pPr>
-        <w:spacing w:after="40" w:before="60"/>
+        <w:spacing w:after="0" w:before="0"/>
         <w:ind w:left="360"/>
       </w:pPr>
       <w:r>
@@ -659,7 +659,7 @@
     </w:p>
     <w:p>
       <w:pPr>
-        <w:spacing w:after="40" w:before="60"/>
+        <w:spacing w:after="0" w:before="0"/>
         <w:ind w:left="360"/>
       </w:pPr>
       <w:r>
@@ -694,7 +694,7 @@
     </w:p>
     <w:p>
       <w:pPr>
-        <w:spacing w:after="40" w:before="60"/>
+        <w:spacing w:after="0" w:before="0"/>
         <w:ind w:left="360"/>
       </w:pPr>
       <w:r>
@@ -729,7 +729,7 @@
     </w:p>
     <w:p>
       <w:pPr>
-        <w:spacing w:after="20" w:before="60"/>
+        <w:spacing w:after="0" w:before="0"/>
       </w:pPr>
       <w:r>
         <w:rPr>
@@ -753,7 +753,7 @@
     </w:p>
     <w:p>
       <w:pPr>
-        <w:spacing w:after="40" w:before="60"/>
+        <w:spacing w:after="0" w:before="0"/>
         <w:ind w:left="360"/>
       </w:pPr>
       <w:r>
@@ -777,7 +777,7 @@
     </w:p>
     <w:p>
       <w:pPr>
-        <w:spacing w:after="40" w:before="60"/>
+        <w:spacing w:after="0" w:before="0"/>
         <w:ind w:left="360"/>
       </w:pPr>
       <w:r>
@@ -801,7 +801,7 @@
     </w:p>
     <w:p>
       <w:pPr>
-        <w:spacing w:after="40" w:before="60"/>
+        <w:spacing w:after="0" w:before="0"/>
         <w:ind w:left="360"/>
       </w:pPr>
       <w:r>
@@ -825,7 +825,7 @@
     </w:p>
     <w:p>
       <w:pPr>
-        <w:spacing w:after="40" w:before="60"/>
+        <w:spacing w:after="0" w:before="0"/>
         <w:ind w:left="360"/>
       </w:pPr>
       <w:r>
@@ -849,7 +849,7 @@
     </w:p>
     <w:p>
       <w:pPr>
-        <w:spacing w:after="40" w:before="60"/>
+        <w:spacing w:after="0" w:before="0"/>
         <w:ind w:left="360"/>
       </w:pPr>
       <w:r>
@@ -876,7 +876,7 @@
         <w:pBdr>
           <w:bottom w:val="single" w:color="1F3A5F" w:sz="8" w:space="4"/>
         </w:pBdr>
-        <w:spacing w:after="20" w:before="80"/>
+        <w:spacing w:after="10" w:before="60"/>
       </w:pPr>
       <w:r>
         <w:rPr>
@@ -903,14 +903,14 @@
         </w:tblBorders>
       </w:tblPr>
       <w:tblGrid>
-        <w:gridCol w:w="1800"/>
-        <w:gridCol w:w="4200"/>
-        <w:gridCol w:w="3360"/>
+        <w:gridCol w:w="1500"/>
+        <w:gridCol w:w="3900"/>
+        <w:gridCol w:w="3960"/>
       </w:tblGrid>
       <w:tr>
         <w:tc>
           <w:tcPr>
-            <w:tcW w:type="dxa" w:w="1800"/>
+            <w:tcW w:type="dxa" w:w="1500"/>
             <w:tcBorders>
               <w:top w:val="single" w:color="CCCCCC" w:sz="1"/>
               <w:left w:val="single" w:color="CCCCCC" w:sz="1"/>
@@ -938,13 +938,13 @@
                 <w:sz w:val="22"/>
                 <w:szCs w:val="22"/>
               </w:rPr>
-              <w:t xml:space="preserve">Relative pronoun</w:t>
+              <w:t xml:space="preserve">Pronoun</w:t>
             </w:r>
           </w:p>
         </w:tc>
         <w:tc>
           <w:tcPr>
-            <w:tcW w:type="dxa" w:w="4200"/>
+            <w:tcW w:type="dxa" w:w="3900"/>
             <w:tcBorders>
               <w:top w:val="single" w:color="CCCCCC" w:sz="1"/>
               <w:left w:val="single" w:color="CCCCCC" w:sz="1"/>
@@ -978,7 +978,7 @@
         </w:tc>
         <w:tc>
           <w:tcPr>
-            <w:tcW w:type="dxa" w:w="3360"/>
+            <w:tcW w:type="dxa" w:w="3960"/>
             <w:tcBorders>
               <w:top w:val="single" w:color="CCCCCC" w:sz="1"/>
               <w:left w:val="single" w:color="CCCCCC" w:sz="1"/>
@@ -1014,7 +1014,7 @@
       <w:tr>
         <w:tc>
           <w:tcPr>
-            <w:tcW w:type="dxa" w:w="1800"/>
+            <w:tcW w:type="dxa" w:w="1500"/>
             <w:tcBorders>
               <w:top w:val="single" w:color="CCCCCC" w:sz="1"/>
               <w:left w:val="single" w:color="CCCCCC" w:sz="1"/>
@@ -1048,7 +1048,7 @@
         </w:tc>
         <w:tc>
           <w:tcPr>
-            <w:tcW w:type="dxa" w:w="4200"/>
+            <w:tcW w:type="dxa" w:w="3900"/>
             <w:tcBorders>
               <w:top w:val="single" w:color="CCCCCC" w:sz="1"/>
               <w:left w:val="single" w:color="CCCCCC" w:sz="1"/>
@@ -1082,7 +1082,7 @@
         </w:tc>
         <w:tc>
           <w:tcPr>
-            <w:tcW w:type="dxa" w:w="3360"/>
+            <w:tcW w:type="dxa" w:w="3960"/>
             <w:tcBorders>
               <w:top w:val="single" w:color="CCCCCC" w:sz="1"/>
               <w:left w:val="single" w:color="CCCCCC" w:sz="1"/>
@@ -1118,7 +1118,7 @@
       <w:tr>
         <w:tc>
           <w:tcPr>
-            <w:tcW w:type="dxa" w:w="1800"/>
+            <w:tcW w:type="dxa" w:w="1500"/>
             <w:tcBorders>
               <w:top w:val="single" w:color="CCCCCC" w:sz="1"/>
               <w:left w:val="single" w:color="CCCCCC" w:sz="1"/>
@@ -1146,13 +1146,13 @@
                 <w:sz w:val="22"/>
                 <w:szCs w:val="22"/>
               </w:rPr>
-              <w:t xml:space="preserve">that</w:t>
+              <w:t xml:space="preserve">which</w:t>
             </w:r>
           </w:p>
         </w:tc>
         <w:tc>
           <w:tcPr>
-            <w:tcW w:type="dxa" w:w="4200"/>
+            <w:tcW w:type="dxa" w:w="3900"/>
             <w:tcBorders>
               <w:top w:val="single" w:color="CCCCCC" w:sz="1"/>
               <w:left w:val="single" w:color="CCCCCC" w:sz="1"/>
@@ -1180,13 +1180,13 @@
                 <w:sz w:val="22"/>
                 <w:szCs w:val="22"/>
               </w:rPr>
-              <w:t xml:space="preserve">for things (also people informally)</w:t>
+              <w:t xml:space="preserve">for things / ideas</w:t>
             </w:r>
           </w:p>
         </w:tc>
         <w:tc>
           <w:tcPr>
-            <w:tcW w:type="dxa" w:w="3360"/>
+            <w:tcW w:type="dxa" w:w="3960"/>
             <w:tcBorders>
               <w:top w:val="single" w:color="CCCCCC" w:sz="1"/>
               <w:left w:val="single" w:color="CCCCCC" w:sz="1"/>
@@ -1214,7 +1214,7 @@
                 <w:sz w:val="22"/>
                 <w:szCs w:val="22"/>
               </w:rPr>
-              <w:t xml:space="preserve">an app that tracks your footprint</w:t>
+              <w:t xml:space="preserve">an app which tracks your footprint</w:t>
             </w:r>
           </w:p>
         </w:tc>
@@ -1222,7 +1222,7 @@
       <w:tr>
         <w:tc>
           <w:tcPr>
-            <w:tcW w:type="dxa" w:w="1800"/>
+            <w:tcW w:type="dxa" w:w="1500"/>
             <w:tcBorders>
               <w:top w:val="single" w:color="CCCCCC" w:sz="1"/>
               <w:left w:val="single" w:color="CCCCCC" w:sz="1"/>
@@ -1250,13 +1250,13 @@
                 <w:sz w:val="22"/>
                 <w:szCs w:val="22"/>
               </w:rPr>
-              <w:t xml:space="preserve">where</w:t>
+              <w:t xml:space="preserve">that</w:t>
             </w:r>
           </w:p>
         </w:tc>
         <w:tc>
           <w:tcPr>
-            <w:tcW w:type="dxa" w:w="4200"/>
+            <w:tcW w:type="dxa" w:w="3900"/>
             <w:tcBorders>
               <w:top w:val="single" w:color="CCCCCC" w:sz="1"/>
               <w:left w:val="single" w:color="CCCCCC" w:sz="1"/>
@@ -1284,13 +1284,13 @@
                 <w:sz w:val="22"/>
                 <w:szCs w:val="22"/>
               </w:rPr>
-              <w:t xml:space="preserve">for places</w:t>
+              <w:t xml:space="preserve">replaces who or which (informal)</w:t>
             </w:r>
           </w:p>
         </w:tc>
         <w:tc>
           <w:tcPr>
-            <w:tcW w:type="dxa" w:w="3360"/>
+            <w:tcW w:type="dxa" w:w="3960"/>
             <w:tcBorders>
               <w:top w:val="single" w:color="CCCCCC" w:sz="1"/>
               <w:left w:val="single" w:color="CCCCCC" w:sz="1"/>
@@ -1318,7 +1318,7 @@
                 <w:sz w:val="22"/>
                 <w:szCs w:val="22"/>
               </w:rPr>
-              <w:t xml:space="preserve">the city where I grew up</w:t>
+              <w:t xml:space="preserve">the app that tracks it  |  the engineer that built it</w:t>
             </w:r>
           </w:p>
         </w:tc>
@@ -1326,7 +1326,7 @@
       <w:tr>
         <w:tc>
           <w:tcPr>
-            <w:tcW w:type="dxa" w:w="1800"/>
+            <w:tcW w:type="dxa" w:w="1500"/>
             <w:tcBorders>
               <w:top w:val="single" w:color="CCCCCC" w:sz="1"/>
               <w:left w:val="single" w:color="CCCCCC" w:sz="1"/>
@@ -1354,13 +1354,13 @@
                 <w:sz w:val="22"/>
                 <w:szCs w:val="22"/>
               </w:rPr>
-              <w:t xml:space="preserve">when</w:t>
+              <w:t xml:space="preserve">where</w:t>
             </w:r>
           </w:p>
         </w:tc>
         <w:tc>
           <w:tcPr>
-            <w:tcW w:type="dxa" w:w="4200"/>
+            <w:tcW w:type="dxa" w:w="3900"/>
             <w:tcBorders>
               <w:top w:val="single" w:color="CCCCCC" w:sz="1"/>
               <w:left w:val="single" w:color="CCCCCC" w:sz="1"/>
@@ -1388,13 +1388,13 @@
                 <w:sz w:val="22"/>
                 <w:szCs w:val="22"/>
               </w:rPr>
-              <w:t xml:space="preserve">for times / periods</w:t>
+              <w:t xml:space="preserve">for places</w:t>
             </w:r>
           </w:p>
         </w:tc>
         <w:tc>
           <w:tcPr>
-            <w:tcW w:type="dxa" w:w="3360"/>
+            <w:tcW w:type="dxa" w:w="3960"/>
             <w:tcBorders>
               <w:top w:val="single" w:color="CCCCCC" w:sz="1"/>
               <w:left w:val="single" w:color="CCCCCC" w:sz="1"/>
@@ -1422,6 +1422,110 @@
                 <w:sz w:val="22"/>
                 <w:szCs w:val="22"/>
               </w:rPr>
+              <w:t xml:space="preserve">the city where I grew up</w:t>
+            </w:r>
+          </w:p>
+        </w:tc>
+      </w:tr>
+      <w:tr>
+        <w:tc>
+          <w:tcPr>
+            <w:tcW w:type="dxa" w:w="1500"/>
+            <w:tcBorders>
+              <w:top w:val="single" w:color="CCCCCC" w:sz="1"/>
+              <w:left w:val="single" w:color="CCCCCC" w:sz="1"/>
+              <w:bottom w:val="single" w:color="CCCCCC" w:sz="1"/>
+              <w:right w:val="single" w:color="CCCCCC" w:sz="1"/>
+            </w:tcBorders>
+            <w:shd w:fill="FFFFFF" w:val="clear"/>
+            <w:tcMar>
+              <w:top w:type="dxa" w:w="60"/>
+              <w:left w:type="dxa" w:w="120"/>
+              <w:bottom w:type="dxa" w:w="60"/>
+              <w:right w:type="dxa" w:w="120"/>
+            </w:tcMar>
+          </w:tcPr>
+          <w:p>
+            <w:pPr>
+              <w:jc w:val="center"/>
+            </w:pPr>
+            <w:r>
+              <w:rPr>
+                <w:rFonts w:ascii="Arial" w:cs="Arial" w:eastAsia="Arial" w:hAnsi="Arial"/>
+                <w:b w:val="false"/>
+                <w:bCs w:val="false"/>
+                <w:color w:val="333333"/>
+                <w:sz w:val="22"/>
+                <w:szCs w:val="22"/>
+              </w:rPr>
+              <w:t xml:space="preserve">when</w:t>
+            </w:r>
+          </w:p>
+        </w:tc>
+        <w:tc>
+          <w:tcPr>
+            <w:tcW w:type="dxa" w:w="3900"/>
+            <w:tcBorders>
+              <w:top w:val="single" w:color="CCCCCC" w:sz="1"/>
+              <w:left w:val="single" w:color="CCCCCC" w:sz="1"/>
+              <w:bottom w:val="single" w:color="CCCCCC" w:sz="1"/>
+              <w:right w:val="single" w:color="CCCCCC" w:sz="1"/>
+            </w:tcBorders>
+            <w:shd w:fill="FFFFFF" w:val="clear"/>
+            <w:tcMar>
+              <w:top w:type="dxa" w:w="60"/>
+              <w:left w:type="dxa" w:w="120"/>
+              <w:bottom w:type="dxa" w:w="60"/>
+              <w:right w:type="dxa" w:w="120"/>
+            </w:tcMar>
+          </w:tcPr>
+          <w:p>
+            <w:pPr>
+              <w:jc w:val="center"/>
+            </w:pPr>
+            <w:r>
+              <w:rPr>
+                <w:rFonts w:ascii="Arial" w:cs="Arial" w:eastAsia="Arial" w:hAnsi="Arial"/>
+                <w:b w:val="false"/>
+                <w:bCs w:val="false"/>
+                <w:color w:val="333333"/>
+                <w:sz w:val="22"/>
+                <w:szCs w:val="22"/>
+              </w:rPr>
+              <w:t xml:space="preserve">for times / periods</w:t>
+            </w:r>
+          </w:p>
+        </w:tc>
+        <w:tc>
+          <w:tcPr>
+            <w:tcW w:type="dxa" w:w="3960"/>
+            <w:tcBorders>
+              <w:top w:val="single" w:color="CCCCCC" w:sz="1"/>
+              <w:left w:val="single" w:color="CCCCCC" w:sz="1"/>
+              <w:bottom w:val="single" w:color="CCCCCC" w:sz="1"/>
+              <w:right w:val="single" w:color="CCCCCC" w:sz="1"/>
+            </w:tcBorders>
+            <w:shd w:fill="FFFFFF" w:val="clear"/>
+            <w:tcMar>
+              <w:top w:type="dxa" w:w="60"/>
+              <w:left w:type="dxa" w:w="120"/>
+              <w:bottom w:type="dxa" w:w="60"/>
+              <w:right w:type="dxa" w:w="120"/>
+            </w:tcMar>
+          </w:tcPr>
+          <w:p>
+            <w:pPr>
+              <w:jc w:val="center"/>
+            </w:pPr>
+            <w:r>
+              <w:rPr>
+                <w:rFonts w:ascii="Arial" w:cs="Arial" w:eastAsia="Arial" w:hAnsi="Arial"/>
+                <w:b w:val="false"/>
+                <w:bCs w:val="false"/>
+                <w:color w:val="333333"/>
+                <w:sz w:val="22"/>
+                <w:szCs w:val="22"/>
+              </w:rPr>
               <w:t xml:space="preserve">the decade when the internet changed everything</w:t>
             </w:r>
           </w:p>
@@ -1430,7 +1534,97 @@
     </w:tbl>
     <w:p>
       <w:pPr>
-        <w:spacing w:after="20" w:before="60"/>
+        <w:spacing w:after="0" w:before="16"/>
+      </w:pPr>
+      <w:r>
+        <w:rPr>
+          <w:rFonts w:ascii="Arial" w:cs="Arial" w:eastAsia="Arial" w:hAnsi="Arial"/>
+          <w:b/>
+          <w:bCs/>
+          <w:color w:val="1F3A5F"/>
+          <w:sz w:val="22"/>
+          <w:szCs w:val="22"/>
+        </w:rPr>
+        <w:t xml:space="preserve">Note: </w:t>
+      </w:r>
+      <w:r>
+        <w:rPr>
+          <w:rFonts w:ascii="Arial" w:cs="Arial" w:eastAsia="Arial" w:hAnsi="Arial"/>
+          <w:b/>
+          <w:bCs/>
+          <w:sz w:val="22"/>
+          <w:szCs w:val="22"/>
+        </w:rPr>
+        <w:t xml:space="preserve">that</w:t>
+      </w:r>
+      <w:r>
+        <w:rPr>
+          <w:rFonts w:ascii="Arial" w:cs="Arial" w:eastAsia="Arial" w:hAnsi="Arial"/>
+          <w:sz w:val="22"/>
+          <w:szCs w:val="22"/>
+        </w:rPr>
+        <w:t xml:space="preserve"> can replace </w:t>
+      </w:r>
+      <w:r>
+        <w:rPr>
+          <w:rFonts w:ascii="Arial" w:cs="Arial" w:eastAsia="Arial" w:hAnsi="Arial"/>
+          <w:b/>
+          <w:bCs/>
+          <w:sz w:val="22"/>
+          <w:szCs w:val="22"/>
+        </w:rPr>
+        <w:t xml:space="preserve">who</w:t>
+      </w:r>
+      <w:r>
+        <w:rPr>
+          <w:rFonts w:ascii="Arial" w:cs="Arial" w:eastAsia="Arial" w:hAnsi="Arial"/>
+          <w:sz w:val="22"/>
+          <w:szCs w:val="22"/>
+        </w:rPr>
+        <w:t xml:space="preserve"> or </w:t>
+      </w:r>
+      <w:r>
+        <w:rPr>
+          <w:rFonts w:ascii="Arial" w:cs="Arial" w:eastAsia="Arial" w:hAnsi="Arial"/>
+          <w:b/>
+          <w:bCs/>
+          <w:sz w:val="22"/>
+          <w:szCs w:val="22"/>
+        </w:rPr>
+        <w:t xml:space="preserve">which</w:t>
+      </w:r>
+      <w:r>
+        <w:rPr>
+          <w:rFonts w:ascii="Arial" w:cs="Arial" w:eastAsia="Arial" w:hAnsi="Arial"/>
+          <w:sz w:val="22"/>
+          <w:szCs w:val="22"/>
+        </w:rPr>
+        <w:t xml:space="preserve"> in defining relative clauses, but </w:t>
+      </w:r>
+      <w:r>
+        <w:rPr>
+          <w:rFonts w:ascii="Arial" w:cs="Arial" w:eastAsia="Arial" w:hAnsi="Arial"/>
+          <w:b/>
+          <w:bCs/>
+          <w:i/>
+          <w:iCs/>
+          <w:sz w:val="22"/>
+          <w:szCs w:val="22"/>
+        </w:rPr>
+        <w:t xml:space="preserve">not</w:t>
+      </w:r>
+      <w:r>
+        <w:rPr>
+          <w:rFonts w:ascii="Arial" w:cs="Arial" w:eastAsia="Arial" w:hAnsi="Arial"/>
+          <w:sz w:val="22"/>
+          <w:szCs w:val="22"/>
+        </w:rPr>
+        <w:t xml:space="preserve"> where or when.</w:t>
+      </w:r>
+    </w:p>
+    <w:p>
+      <w:pPr>
+        <w:spacing w:after="0" w:before="0"/>
       </w:pPr>
       <w:r>
         <w:rPr>
@@ -1449,12 +1643,12 @@
           <w:sz w:val="22"/>
           <w:szCs w:val="22"/>
         </w:rPr>
-        <w:t xml:space="preserve">Complete each sentence with who, that, where, or when.</w:t>
-      </w:r>
-    </w:p>
-    <w:p>
-      <w:pPr>
-        <w:spacing w:after="40" w:before="60"/>
+        <w:t xml:space="preserve">Complete each sentence with who, which, that, where, or when.</w:t>
+      </w:r>
+    </w:p>
+    <w:p>
+      <w:pPr>
+        <w:spacing w:after="0" w:before="0"/>
         <w:ind w:left="360"/>
       </w:pPr>
       <w:r>
@@ -1478,7 +1672,7 @@
     </w:p>
     <w:p>
       <w:pPr>
-        <w:spacing w:after="40" w:before="60"/>
+        <w:spacing w:after="0" w:before="0"/>
         <w:ind w:left="360"/>
       </w:pPr>
       <w:r>
@@ -1502,7 +1696,7 @@
     </w:p>
     <w:p>
       <w:pPr>
-        <w:spacing w:after="40" w:before="60"/>
+        <w:spacing w:after="0" w:before="0"/>
         <w:ind w:left="360"/>
       </w:pPr>
       <w:r>
@@ -1526,7 +1720,7 @@
     </w:p>
     <w:p>
       <w:pPr>
-        <w:spacing w:after="40" w:before="60"/>
+        <w:spacing w:after="0" w:before="0"/>
         <w:ind w:left="360"/>
       </w:pPr>
       <w:r>
@@ -1550,7 +1744,7 @@
     </w:p>
     <w:p>
       <w:pPr>
-        <w:spacing w:after="40" w:before="60"/>
+        <w:spacing w:after="0" w:before="0"/>
         <w:ind w:left="360"/>
       </w:pPr>
       <w:r>
@@ -1574,7 +1768,7 @@
     </w:p>
     <w:p>
       <w:pPr>
-        <w:spacing w:after="20" w:before="60"/>
+        <w:spacing w:after="0" w:before="0"/>
       </w:pPr>
       <w:r>
         <w:rPr>
@@ -1631,7 +1825,7 @@
           </w:tcPr>
           <w:p>
             <w:pPr>
-              <w:spacing w:after="20" w:before="20"/>
+              <w:spacing w:after="0" w:before="0"/>
             </w:pPr>
             <w:r>
               <w:rPr>
@@ -1646,7 +1840,7 @@
           </w:p>
           <w:p>
             <w:pPr>
-              <w:spacing w:after="20" w:before="20"/>
+              <w:spacing w:after="0" w:before="0"/>
             </w:pPr>
             <w:r>
               <w:rPr>
@@ -1674,7 +1868,7 @@
     </w:tbl>
     <w:p>
       <w:pPr>
-        <w:spacing w:after="0" w:before="50"/>
+        <w:spacing w:after="0" w:before="0"/>
         <w:ind w:left="360"/>
       </w:pPr>
       <w:r>
@@ -1688,7 +1882,7 @@
     </w:p>
     <w:p>
       <w:pPr>
-        <w:spacing w:after="40" w:before="0"/>
+        <w:spacing w:after="0" w:before="0"/>
         <w:ind w:left="360"/>
       </w:pPr>
       <w:r>
@@ -1711,7 +1905,7 @@
     </w:p>
     <w:p>
       <w:pPr>
-        <w:spacing w:after="0" w:before="50"/>
+        <w:spacing w:after="0" w:before="0"/>
         <w:ind w:left="360"/>
       </w:pPr>
       <w:r>
@@ -1725,7 +1919,7 @@
     </w:p>
     <w:p>
       <w:pPr>
-        <w:spacing w:after="40" w:before="0"/>
+        <w:spacing w:after="0" w:before="0"/>
         <w:ind w:left="360"/>
       </w:pPr>
       <w:r>
@@ -1748,7 +1942,7 @@
     </w:p>
     <w:p>
       <w:pPr>
-        <w:spacing w:after="0" w:before="50"/>
+        <w:spacing w:after="0" w:before="0"/>
         <w:ind w:left="360"/>
       </w:pPr>
       <w:r>
@@ -1762,7 +1956,7 @@
     </w:p>
     <w:p>
       <w:pPr>
-        <w:spacing w:after="40" w:before="0"/>
+        <w:spacing w:after="0" w:before="0"/>
         <w:ind w:left="360"/>
       </w:pPr>
       <w:r>
@@ -1785,7 +1979,7 @@
     </w:p>
     <w:p>
       <w:pPr>
-        <w:spacing w:after="0" w:before="50"/>
+        <w:spacing w:after="0" w:before="0"/>
         <w:ind w:left="360"/>
       </w:pPr>
       <w:r>
@@ -1799,7 +1993,7 @@
     </w:p>
     <w:p>
       <w:pPr>
-        <w:spacing w:after="40" w:before="0"/>
+        <w:spacing w:after="0" w:before="0"/>
         <w:ind w:left="360"/>
       </w:pPr>
       <w:r>
@@ -1833,7 +2027,7 @@
         <w:pBdr>
           <w:bottom w:val="single" w:color="1F3A5F" w:sz="8" w:space="4"/>
         </w:pBdr>
-        <w:spacing w:after="20" w:before="80"/>
+        <w:spacing w:after="10" w:before="60"/>
       </w:pPr>
       <w:r>
         <w:rPr>
@@ -1882,7 +2076,7 @@
           </w:tcPr>
           <w:p>
             <w:pPr>
-              <w:spacing w:after="20" w:before="20"/>
+              <w:spacing w:after="0" w:before="0"/>
             </w:pPr>
             <w:r>
               <w:rPr>
@@ -1906,7 +2100,7 @@
           </w:p>
           <w:p>
             <w:pPr>
-              <w:spacing w:after="20" w:before="20"/>
+              <w:spacing w:after="0" w:before="0"/>
             </w:pPr>
             <w:r>
               <w:rPr>
@@ -1931,7 +2125,7 @@
           </w:p>
           <w:p>
             <w:pPr>
-              <w:spacing w:after="20" w:before="20"/>
+              <w:spacing w:after="0" w:before="0"/>
             </w:pPr>
             <w:r>
               <w:rPr>
@@ -1944,7 +2138,7 @@
           </w:p>
           <w:p>
             <w:pPr>
-              <w:spacing w:after="20" w:before="20"/>
+              <w:spacing w:after="0" w:before="0"/>
             </w:pPr>
             <w:r>
               <w:rPr>
@@ -1968,7 +2162,7 @@
           </w:p>
           <w:p>
             <w:pPr>
-              <w:spacing w:after="20" w:before="20"/>
+              <w:spacing w:after="0" w:before="0"/>
             </w:pPr>
             <w:r>
               <w:rPr>
@@ -1993,7 +2187,7 @@
           </w:p>
           <w:p>
             <w:pPr>
-              <w:spacing w:after="20" w:before="20"/>
+              <w:spacing w:after="0" w:before="0"/>
             </w:pPr>
             <w:r>
               <w:rPr>
@@ -2006,7 +2200,7 @@
           </w:p>
           <w:p>
             <w:pPr>
-              <w:spacing w:after="20" w:before="20"/>
+              <w:spacing w:after="0" w:before="0"/>
             </w:pPr>
             <w:r>
               <w:rPr>
@@ -2030,7 +2224,7 @@
           </w:p>
           <w:p>
             <w:pPr>
-              <w:spacing w:after="20" w:before="20"/>
+              <w:spacing w:after="0" w:before="0"/>
             </w:pPr>
             <w:r>
               <w:rPr>
@@ -2055,7 +2249,7 @@
           </w:p>
           <w:p>
             <w:pPr>
-              <w:spacing w:after="20" w:before="20"/>
+              <w:spacing w:after="0" w:before="0"/>
             </w:pPr>
             <w:r>
               <w:rPr>
@@ -2068,7 +2262,7 @@
           </w:p>
           <w:p>
             <w:pPr>
-              <w:spacing w:after="20" w:before="20"/>
+              <w:spacing w:after="0" w:before="0"/>
             </w:pPr>
             <w:r>
               <w:rPr>
@@ -2122,7 +2316,7 @@
     </w:tbl>
     <w:p>
       <w:pPr>
-        <w:spacing w:after="20" w:before="60"/>
+        <w:spacing w:after="0" w:before="0"/>
       </w:pPr>
       <w:r>
         <w:rPr>
@@ -2146,7 +2340,7 @@
     </w:p>
     <w:p>
       <w:pPr>
-        <w:spacing w:after="40" w:before="60"/>
+        <w:spacing w:after="0" w:before="0"/>
         <w:ind w:left="360"/>
       </w:pPr>
       <w:r>
@@ -2181,7 +2375,7 @@
     </w:p>
     <w:p>
       <w:pPr>
-        <w:spacing w:after="40" w:before="60"/>
+        <w:spacing w:after="0" w:before="0"/>
         <w:ind w:left="360"/>
       </w:pPr>
       <w:r>
@@ -2216,7 +2410,7 @@
     </w:p>
     <w:p>
       <w:pPr>
-        <w:spacing w:after="40" w:before="60"/>
+        <w:spacing w:after="0" w:before="0"/>
         <w:ind w:left="360"/>
       </w:pPr>
       <w:r>
@@ -2251,7 +2445,7 @@
     </w:p>
     <w:p>
       <w:pPr>
-        <w:spacing w:after="40" w:before="60"/>
+        <w:spacing w:after="0" w:before="0"/>
         <w:ind w:left="360"/>
       </w:pPr>
       <w:r>
@@ -2286,7 +2480,7 @@
     </w:p>
     <w:p>
       <w:pPr>
-        <w:spacing w:after="40" w:before="60"/>
+        <w:spacing w:after="0" w:before="0"/>
         <w:ind w:left="360"/>
       </w:pPr>
       <w:r>
@@ -2321,7 +2515,7 @@
     </w:p>
     <w:p>
       <w:pPr>
-        <w:spacing w:after="20" w:before="60"/>
+        <w:spacing w:after="0" w:before="0"/>
       </w:pPr>
       <w:r>
         <w:rPr>
@@ -2345,7 +2539,7 @@
     </w:p>
     <w:p>
       <w:pPr>
-        <w:spacing w:after="0" w:before="50"/>
+        <w:spacing w:after="0" w:before="0"/>
         <w:ind w:left="360"/>
       </w:pPr>
       <w:r>
@@ -2359,7 +2553,7 @@
     </w:p>
     <w:p>
       <w:pPr>
-        <w:spacing w:after="40" w:before="0"/>
+        <w:spacing w:after="0" w:before="0"/>
         <w:ind w:left="360"/>
       </w:pPr>
       <w:r>
@@ -2382,7 +2576,7 @@
     </w:p>
     <w:p>
       <w:pPr>
-        <w:spacing w:after="0" w:before="50"/>
+        <w:spacing w:after="0" w:before="0"/>
         <w:ind w:left="360"/>
       </w:pPr>
       <w:r>
@@ -2396,7 +2590,7 @@
     </w:p>
     <w:p>
       <w:pPr>
-        <w:spacing w:after="40" w:before="0"/>
+        <w:spacing w:after="0" w:before="0"/>
         <w:ind w:left="360"/>
       </w:pPr>
       <w:r>
@@ -2419,7 +2613,7 @@
     </w:p>
     <w:p>
       <w:pPr>
-        <w:spacing w:after="0" w:before="50"/>
+        <w:spacing w:after="0" w:before="0"/>
         <w:ind w:left="360"/>
       </w:pPr>
       <w:r>
@@ -2433,7 +2627,7 @@
     </w:p>
     <w:p>
       <w:pPr>
-        <w:spacing w:after="40" w:before="0"/>
+        <w:spacing w:after="0" w:before="0"/>
         <w:ind w:left="360"/>
       </w:pPr>
       <w:r>
@@ -2456,7 +2650,7 @@
     </w:p>
     <w:p>
       <w:pPr>
-        <w:spacing w:after="0" w:before="50"/>
+        <w:spacing w:after="0" w:before="0"/>
         <w:ind w:left="360"/>
       </w:pPr>
       <w:r>
@@ -2470,7 +2664,7 @@
     </w:p>
     <w:p>
       <w:pPr>
-        <w:spacing w:after="40" w:before="0"/>
+        <w:spacing w:after="0" w:before="0"/>
         <w:ind w:left="360"/>
       </w:pPr>
       <w:r>
@@ -2493,7 +2687,7 @@
     </w:p>
     <w:p>
       <w:pPr>
-        <w:spacing w:after="0" w:before="50"/>
+        <w:spacing w:after="0" w:before="0"/>
         <w:ind w:left="360"/>
       </w:pPr>
       <w:r>
@@ -2507,7 +2701,7 @@
     </w:p>
     <w:p>
       <w:pPr>
-        <w:spacing w:after="40" w:before="0"/>
+        <w:spacing w:after="0" w:before="0"/>
         <w:ind w:left="360"/>
       </w:pPr>
       <w:r>
@@ -2533,7 +2727,7 @@
         <w:pBdr>
           <w:bottom w:val="single" w:color="1F3A5F" w:sz="8" w:space="4"/>
         </w:pBdr>
-        <w:spacing w:after="20" w:before="80"/>
+        <w:spacing w:after="10" w:before="60"/>
       </w:pPr>
       <w:r>
         <w:rPr>
@@ -2582,7 +2776,7 @@
           </w:tcPr>
           <w:p>
             <w:pPr>
-              <w:spacing w:after="20" w:before="20"/>
+              <w:spacing w:after="0" w:before="0"/>
             </w:pPr>
             <w:r>
               <w:rPr>
@@ -2605,7 +2799,7 @@
           </w:p>
           <w:p>
             <w:pPr>
-              <w:spacing w:after="20" w:before="20"/>
+              <w:spacing w:after="0" w:before="0"/>
             </w:pPr>
             <w:r>
               <w:rPr>
@@ -2628,7 +2822,7 @@
           </w:p>
           <w:p>
             <w:pPr>
-              <w:spacing w:after="20" w:before="20"/>
+              <w:spacing w:after="0" w:before="0"/>
             </w:pPr>
             <w:r>
               <w:rPr>
@@ -2641,7 +2835,7 @@
           </w:p>
           <w:p>
             <w:pPr>
-              <w:spacing w:after="20" w:before="20"/>
+              <w:spacing w:after="0" w:before="0"/>
             </w:pPr>
             <w:r>
               <w:rPr>
@@ -2678,7 +2872,7 @@
           </w:p>
           <w:p>
             <w:pPr>
-              <w:spacing w:after="20" w:before="20"/>
+              <w:spacing w:after="0" w:before="0"/>
             </w:pPr>
             <w:r>
               <w:rPr>
@@ -2715,7 +2909,7 @@
           </w:p>
           <w:p>
             <w:pPr>
-              <w:spacing w:after="20" w:before="20"/>
+              <w:spacing w:after="0" w:before="0"/>
             </w:pPr>
             <w:r>
               <w:rPr>
@@ -2752,7 +2946,7 @@
           </w:p>
           <w:p>
             <w:pPr>
-              <w:spacing w:after="20" w:before="20"/>
+              <w:spacing w:after="0" w:before="0"/>
             </w:pPr>
             <w:r>
               <w:rPr>
@@ -2765,7 +2959,7 @@
           </w:p>
           <w:p>
             <w:pPr>
-              <w:spacing w:after="20" w:before="20"/>
+              <w:spacing w:after="0" w:before="0"/>
             </w:pPr>
             <w:r>
               <w:rPr>
@@ -2791,7 +2985,7 @@
     </w:tbl>
     <w:p>
       <w:pPr>
-        <w:spacing w:after="20" w:before="60"/>
+        <w:spacing w:after="0" w:before="0"/>
       </w:pPr>
       <w:r>
         <w:rPr>
@@ -2815,7 +3009,7 @@
     </w:p>
     <w:p>
       <w:pPr>
-        <w:spacing w:after="40" w:before="60"/>
+        <w:spacing w:after="0" w:before="0"/>
         <w:ind w:left="360"/>
       </w:pPr>
       <w:r>
@@ -2839,7 +3033,7 @@
     </w:p>
     <w:p>
       <w:pPr>
-        <w:spacing w:after="40" w:before="60"/>
+        <w:spacing w:after="0" w:before="0"/>
         <w:ind w:left="360"/>
       </w:pPr>
       <w:r>
@@ -2863,7 +3057,7 @@
     </w:p>
     <w:p>
       <w:pPr>
-        <w:spacing w:after="40" w:before="60"/>
+        <w:spacing w:after="0" w:before="0"/>
         <w:ind w:left="360"/>
       </w:pPr>
       <w:r>
@@ -2887,7 +3081,7 @@
     </w:p>
     <w:p>
       <w:pPr>
-        <w:spacing w:after="40" w:before="60"/>
+        <w:spacing w:after="0" w:before="0"/>
         <w:ind w:left="360"/>
       </w:pPr>
       <w:r>
@@ -2911,7 +3105,7 @@
     </w:p>
     <w:p>
       <w:pPr>
-        <w:spacing w:after="40" w:before="60"/>
+        <w:spacing w:after="0" w:before="0"/>
         <w:ind w:left="360"/>
       </w:pPr>
       <w:r>
@@ -2946,7 +3140,7 @@
         <w:pBdr>
           <w:bottom w:val="single" w:color="1F3A5F" w:sz="8" w:space="4"/>
         </w:pBdr>
-        <w:spacing w:after="20" w:before="80"/>
+        <w:spacing w:after="10" w:before="60"/>
       </w:pPr>
       <w:r>
         <w:rPr>
@@ -2962,7 +3156,7 @@
     </w:p>
     <w:p>
       <w:pPr>
-        <w:spacing w:after="0" w:before="60"/>
+        <w:spacing w:after="0" w:before="0"/>
       </w:pPr>
       <w:r>
         <w:rPr>
@@ -3516,7 +3710,7 @@
     </w:tbl>
     <w:p>
       <w:pPr>
-        <w:spacing w:after="20" w:before="60"/>
+        <w:spacing w:after="0" w:before="0"/>
       </w:pPr>
       <w:r>
         <w:rPr>
@@ -3540,7 +3734,7 @@
     </w:p>
     <w:p>
       <w:pPr>
-        <w:spacing w:after="40" w:before="60"/>
+        <w:spacing w:after="0" w:before="0"/>
         <w:ind w:left="360"/>
       </w:pPr>
       <w:r>
@@ -3564,7 +3758,7 @@
     </w:p>
     <w:p>
       <w:pPr>
-        <w:spacing w:after="40" w:before="60"/>
+        <w:spacing w:after="0" w:before="0"/>
         <w:ind w:left="360"/>
       </w:pPr>
       <w:r>
@@ -3588,7 +3782,7 @@
     </w:p>
     <w:p>
       <w:pPr>
-        <w:spacing w:after="40" w:before="60"/>
+        <w:spacing w:after="0" w:before="0"/>
         <w:ind w:left="360"/>
       </w:pPr>
       <w:r>
@@ -3612,7 +3806,7 @@
     </w:p>
     <w:p>
       <w:pPr>
-        <w:spacing w:after="40" w:before="60"/>
+        <w:spacing w:after="0" w:before="0"/>
         <w:ind w:left="360"/>
       </w:pPr>
       <w:r>
@@ -3636,7 +3830,7 @@
     </w:p>
     <w:p>
       <w:pPr>
-        <w:spacing w:after="40" w:before="60"/>
+        <w:spacing w:after="0" w:before="0"/>
         <w:ind w:left="360"/>
       </w:pPr>
       <w:r>
@@ -3660,7 +3854,7 @@
     </w:p>
     <w:p>
       <w:pPr>
-        <w:spacing w:after="0" w:before="60"/>
+        <w:spacing w:after="0" w:before="0"/>
       </w:pPr>
       <w:r>
         <w:rPr>
@@ -3709,7 +3903,7 @@
           </w:tcPr>
           <w:p>
             <w:pPr>
-              <w:spacing w:after="20" w:before="20"/>
+              <w:spacing w:after="0" w:before="0"/>
             </w:pPr>
             <w:r>
               <w:rPr>
@@ -3733,7 +3927,7 @@
           </w:p>
           <w:p>
             <w:pPr>
-              <w:spacing w:after="20" w:before="20"/>
+              <w:spacing w:after="0" w:before="0"/>
             </w:pPr>
             <w:r>
               <w:rPr>
@@ -3770,7 +3964,7 @@
           </w:p>
           <w:p>
             <w:pPr>
-              <w:spacing w:after="20" w:before="20"/>
+              <w:spacing w:after="0" w:before="0"/>
             </w:pPr>
             <w:r>
               <w:rPr>
@@ -3783,7 +3977,7 @@
           </w:p>
           <w:p>
             <w:pPr>
-              <w:spacing w:after="20" w:before="20"/>
+              <w:spacing w:after="0" w:before="0"/>
             </w:pPr>
             <w:r>
               <w:rPr>
@@ -3807,7 +4001,7 @@
           </w:p>
           <w:p>
             <w:pPr>
-              <w:spacing w:after="20" w:before="20"/>
+              <w:spacing w:after="0" w:before="0"/>
             </w:pPr>
             <w:r>
               <w:rPr>
@@ -3847,7 +4041,7 @@
     </w:tbl>
     <w:p>
       <w:pPr>
-        <w:spacing w:after="20" w:before="60"/>
+        <w:spacing w:after="0" w:before="0"/>
       </w:pPr>
       <w:r>
         <w:rPr>
@@ -3871,7 +4065,7 @@
     </w:p>
     <w:p>
       <w:pPr>
-        <w:spacing w:after="40" w:before="60"/>
+        <w:spacing w:after="0" w:before="0"/>
         <w:ind w:left="360"/>
       </w:pPr>
       <w:r>
@@ -3906,7 +4100,7 @@
     </w:p>
     <w:p>
       <w:pPr>
-        <w:spacing w:after="40" w:before="60"/>
+        <w:spacing w:after="0" w:before="0"/>
         <w:ind w:left="360"/>
       </w:pPr>
       <w:r>
@@ -3941,7 +4135,7 @@
     </w:p>
     <w:p>
       <w:pPr>
-        <w:spacing w:after="40" w:before="60"/>
+        <w:spacing w:after="0" w:before="0"/>
         <w:ind w:left="360"/>
       </w:pPr>
       <w:r>
@@ -3976,7 +4170,7 @@
     </w:p>
     <w:p>
       <w:pPr>
-        <w:spacing w:after="40" w:before="60"/>
+        <w:spacing w:after="0" w:before="0"/>
         <w:ind w:left="360"/>
       </w:pPr>
       <w:r>
@@ -4011,7 +4205,7 @@
     </w:p>
     <w:p>
       <w:pPr>
-        <w:spacing w:after="40" w:before="60"/>
+        <w:spacing w:after="0" w:before="0"/>
         <w:ind w:left="360"/>
       </w:pPr>
       <w:r>
@@ -4046,7 +4240,7 @@
     </w:p>
     <w:p>
       <w:pPr>
-        <w:spacing w:after="0" w:before="60"/>
+        <w:spacing w:after="0" w:before="0"/>
       </w:pPr>
       <w:r>
         <w:rPr>
@@ -4337,7 +4531,7 @@
     </w:tbl>
     <w:p>
       <w:pPr>
-        <w:spacing w:after="20" w:before="60"/>
+        <w:spacing w:after="0" w:before="0"/>
       </w:pPr>
       <w:r>
         <w:rPr>
@@ -4361,7 +4555,7 @@
     </w:p>
     <w:p>
       <w:pPr>
-        <w:spacing w:after="40" w:before="60"/>
+        <w:spacing w:after="0" w:before="0"/>
         <w:ind w:left="360"/>
       </w:pPr>
       <w:r>
@@ -4385,7 +4579,7 @@
     </w:p>
     <w:p>
       <w:pPr>
-        <w:spacing w:after="40" w:before="60"/>
+        <w:spacing w:after="0" w:before="0"/>
         <w:ind w:left="360"/>
       </w:pPr>
       <w:r>
@@ -4409,7 +4603,7 @@
     </w:p>
     <w:p>
       <w:pPr>
-        <w:spacing w:after="40" w:before="60"/>
+        <w:spacing w:after="0" w:before="0"/>
         <w:ind w:left="360"/>
       </w:pPr>
       <w:r>
@@ -4433,7 +4627,7 @@
     </w:p>
     <w:p>
       <w:pPr>
-        <w:spacing w:after="40" w:before="60"/>
+        <w:spacing w:after="0" w:before="0"/>
         <w:ind w:left="360"/>
       </w:pPr>
       <w:r>
@@ -4457,7 +4651,7 @@
     </w:p>
     <w:p>
       <w:pPr>
-        <w:spacing w:after="40" w:before="60"/>
+        <w:spacing w:after="0" w:before="0"/>
         <w:ind w:left="360"/>
       </w:pPr>
       <w:r>
@@ -4481,7 +4675,7 @@
     </w:p>
     <w:p>
       <w:pPr>
-        <w:spacing w:after="0" w:before="60"/>
+        <w:spacing w:after="0" w:before="0"/>
       </w:pPr>
       <w:r>
         <w:rPr>
@@ -4497,7 +4691,7 @@
     </w:p>
     <w:p>
       <w:pPr>
-        <w:spacing w:after="30" w:before="0"/>
+        <w:spacing w:after="0" w:before="0"/>
       </w:pPr>
       <w:r>
         <w:rPr>
@@ -4510,7 +4704,7 @@
     </w:p>
     <w:p>
       <w:pPr>
-        <w:spacing w:after="40" w:before="60"/>
+        <w:spacing w:after="0" w:before="0"/>
         <w:ind w:left="360"/>
       </w:pPr>
       <w:r>
@@ -4534,7 +4728,7 @@
     </w:p>
     <w:p>
       <w:pPr>
-        <w:spacing w:after="40" w:before="60"/>
+        <w:spacing w:after="0" w:before="0"/>
         <w:ind w:left="360"/>
       </w:pPr>
       <w:r>
@@ -4558,7 +4752,7 @@
     </w:p>
     <w:p>
       <w:pPr>
-        <w:spacing w:after="40" w:before="60"/>
+        <w:spacing w:after="0" w:before="0"/>
         <w:ind w:left="360"/>
       </w:pPr>
       <w:r>
@@ -4582,7 +4776,7 @@
     </w:p>
     <w:p>
       <w:pPr>
-        <w:spacing w:after="40" w:before="60"/>
+        <w:spacing w:after="0" w:before="0"/>
         <w:ind w:left="360"/>
       </w:pPr>
       <w:r>
@@ -4606,7 +4800,7 @@
     </w:p>
     <w:p>
       <w:pPr>
-        <w:spacing w:after="40" w:before="60"/>
+        <w:spacing w:after="0" w:before="0"/>
         <w:ind w:left="360"/>
       </w:pPr>
       <w:r>
@@ -4633,7 +4827,7 @@
         <w:pBdr>
           <w:top w:val="single" w:color="CCCCCC" w:sz="4" w:space="6"/>
         </w:pBdr>
-        <w:spacing w:after="0" w:before="80"/>
+        <w:spacing w:after="0" w:before="60"/>
         <w:jc w:val="center"/>
       </w:pPr>
       <w:r>

</xml_diff>

<commit_message>
Fix spacing: remove page breaks, gap between parts, room between exercises
</commit_message>
<xml_diff>
--- a/Inter1_Test3_Reinforcement.docx
+++ b/Inter1_Test3_Reinforcement.docx
@@ -151,7 +151,7 @@
         <w:pBdr>
           <w:bottom w:val="single" w:color="1F3A5F" w:sz="8" w:space="4"/>
         </w:pBdr>
-        <w:spacing w:after="10" w:before="60"/>
+        <w:spacing w:after="60" w:before="280"/>
       </w:pPr>
       <w:r>
         <w:rPr>
@@ -530,7 +530,7 @@
     </w:tbl>
     <w:p>
       <w:pPr>
-        <w:spacing w:after="0" w:before="0"/>
+        <w:spacing w:after="30" w:before="160"/>
       </w:pPr>
       <w:r>
         <w:rPr>
@@ -729,7 +729,7 @@
     </w:p>
     <w:p>
       <w:pPr>
-        <w:spacing w:after="0" w:before="0"/>
+        <w:spacing w:after="30" w:before="160"/>
       </w:pPr>
       <w:r>
         <w:rPr>
@@ -876,7 +876,7 @@
         <w:pBdr>
           <w:bottom w:val="single" w:color="1F3A5F" w:sz="8" w:space="4"/>
         </w:pBdr>
-        <w:spacing w:after="10" w:before="60"/>
+        <w:spacing w:after="60" w:before="280"/>
       </w:pPr>
       <w:r>
         <w:rPr>
@@ -1624,7 +1624,7 @@
     </w:p>
     <w:p>
       <w:pPr>
-        <w:spacing w:after="0" w:before="0"/>
+        <w:spacing w:after="30" w:before="160"/>
       </w:pPr>
       <w:r>
         <w:rPr>
@@ -1768,7 +1768,7 @@
     </w:p>
     <w:p>
       <w:pPr>
-        <w:spacing w:after="0" w:before="0"/>
+        <w:spacing w:after="30" w:before="160"/>
       </w:pPr>
       <w:r>
         <w:rPr>
@@ -2016,18 +2016,10 @@
     </w:p>
     <w:p>
       <w:pPr>
-        <w:spacing w:after="0" w:before="0"/>
-      </w:pPr>
-      <w:r>
-        <w:br w:type="page"/>
-      </w:r>
-    </w:p>
-    <w:p>
-      <w:pPr>
         <w:pBdr>
           <w:bottom w:val="single" w:color="1F3A5F" w:sz="8" w:space="4"/>
         </w:pBdr>
-        <w:spacing w:after="10" w:before="60"/>
+        <w:spacing w:after="60" w:before="280"/>
       </w:pPr>
       <w:r>
         <w:rPr>
@@ -2316,7 +2308,7 @@
     </w:tbl>
     <w:p>
       <w:pPr>
-        <w:spacing w:after="0" w:before="0"/>
+        <w:spacing w:after="30" w:before="160"/>
       </w:pPr>
       <w:r>
         <w:rPr>
@@ -2515,7 +2507,7 @@
     </w:p>
     <w:p>
       <w:pPr>
-        <w:spacing w:after="0" w:before="0"/>
+        <w:spacing w:after="30" w:before="160"/>
       </w:pPr>
       <w:r>
         <w:rPr>
@@ -2727,7 +2719,7 @@
         <w:pBdr>
           <w:bottom w:val="single" w:color="1F3A5F" w:sz="8" w:space="4"/>
         </w:pBdr>
-        <w:spacing w:after="10" w:before="60"/>
+        <w:spacing w:after="60" w:before="280"/>
       </w:pPr>
       <w:r>
         <w:rPr>
@@ -2985,7 +2977,7 @@
     </w:tbl>
     <w:p>
       <w:pPr>
-        <w:spacing w:after="0" w:before="0"/>
+        <w:spacing w:after="30" w:before="160"/>
       </w:pPr>
       <w:r>
         <w:rPr>
@@ -3129,18 +3121,10 @@
     </w:p>
     <w:p>
       <w:pPr>
-        <w:spacing w:after="0" w:before="0"/>
-      </w:pPr>
-      <w:r>
-        <w:br w:type="page"/>
-      </w:r>
-    </w:p>
-    <w:p>
-      <w:pPr>
         <w:pBdr>
           <w:bottom w:val="single" w:color="1F3A5F" w:sz="8" w:space="4"/>
         </w:pBdr>
-        <w:spacing w:after="10" w:before="60"/>
+        <w:spacing w:after="60" w:before="280"/>
       </w:pPr>
       <w:r>
         <w:rPr>
@@ -3156,7 +3140,7 @@
     </w:p>
     <w:p>
       <w:pPr>
-        <w:spacing w:after="0" w:before="0"/>
+        <w:spacing w:after="20" w:before="120"/>
       </w:pPr>
       <w:r>
         <w:rPr>
@@ -3710,7 +3694,7 @@
     </w:tbl>
     <w:p>
       <w:pPr>
-        <w:spacing w:after="0" w:before="0"/>
+        <w:spacing w:after="30" w:before="160"/>
       </w:pPr>
       <w:r>
         <w:rPr>
@@ -3854,7 +3838,7 @@
     </w:p>
     <w:p>
       <w:pPr>
-        <w:spacing w:after="0" w:before="0"/>
+        <w:spacing w:after="20" w:before="120"/>
       </w:pPr>
       <w:r>
         <w:rPr>
@@ -4041,7 +4025,7 @@
     </w:tbl>
     <w:p>
       <w:pPr>
-        <w:spacing w:after="0" w:before="0"/>
+        <w:spacing w:after="30" w:before="160"/>
       </w:pPr>
       <w:r>
         <w:rPr>
@@ -4240,7 +4224,7 @@
     </w:p>
     <w:p>
       <w:pPr>
-        <w:spacing w:after="0" w:before="0"/>
+        <w:spacing w:after="20" w:before="120"/>
       </w:pPr>
       <w:r>
         <w:rPr>
@@ -4531,7 +4515,7 @@
     </w:tbl>
     <w:p>
       <w:pPr>
-        <w:spacing w:after="0" w:before="0"/>
+        <w:spacing w:after="30" w:before="160"/>
       </w:pPr>
       <w:r>
         <w:rPr>
@@ -4675,7 +4659,7 @@
     </w:p>
     <w:p>
       <w:pPr>
-        <w:spacing w:after="0" w:before="0"/>
+        <w:spacing w:after="20" w:before="120"/>
       </w:pPr>
       <w:r>
         <w:rPr>

</xml_diff>

<commit_message>
Add keepNext to prevent exercises breaking across pages
</commit_message>
<xml_diff>
--- a/Inter1_Test3_Reinforcement.docx
+++ b/Inter1_Test3_Reinforcement.docx
@@ -148,6 +148,7 @@
     </w:p>
     <w:p>
       <w:pPr>
+        <w:keepNext/>
         <w:pBdr>
           <w:bottom w:val="single" w:color="1F3A5F" w:sz="8" w:space="4"/>
         </w:pBdr>
@@ -181,6 +182,9 @@
         <w:gridCol w:w="9360"/>
       </w:tblGrid>
       <w:tr>
+        <w:trPr>
+          <w:cantSplit/>
+        </w:trPr>
         <w:tc>
           <w:tcPr>
             <w:tcW w:type="dxa" w:w="9360"/>
@@ -530,6 +534,7 @@
     </w:tbl>
     <w:p>
       <w:pPr>
+        <w:keepNext/>
         <w:spacing w:after="30" w:before="160"/>
       </w:pPr>
       <w:r>
@@ -554,6 +559,7 @@
     </w:p>
     <w:p>
       <w:pPr>
+        <w:keepNext/>
         <w:spacing w:after="0" w:before="0"/>
         <w:ind w:left="360"/>
       </w:pPr>
@@ -589,6 +595,7 @@
     </w:p>
     <w:p>
       <w:pPr>
+        <w:keepNext/>
         <w:spacing w:after="0" w:before="0"/>
         <w:ind w:left="360"/>
       </w:pPr>
@@ -624,6 +631,7 @@
     </w:p>
     <w:p>
       <w:pPr>
+        <w:keepNext/>
         <w:spacing w:after="0" w:before="0"/>
         <w:ind w:left="360"/>
       </w:pPr>
@@ -659,6 +667,7 @@
     </w:p>
     <w:p>
       <w:pPr>
+        <w:keepNext/>
         <w:spacing w:after="0" w:before="0"/>
         <w:ind w:left="360"/>
       </w:pPr>
@@ -694,6 +703,7 @@
     </w:p>
     <w:p>
       <w:pPr>
+        <w:keepNext/>
         <w:spacing w:after="0" w:before="0"/>
         <w:ind w:left="360"/>
       </w:pPr>
@@ -729,6 +739,7 @@
     </w:p>
     <w:p>
       <w:pPr>
+        <w:keepNext/>
         <w:spacing w:after="30" w:before="160"/>
       </w:pPr>
       <w:r>
@@ -753,6 +764,7 @@
     </w:p>
     <w:p>
       <w:pPr>
+        <w:keepNext/>
         <w:spacing w:after="0" w:before="0"/>
         <w:ind w:left="360"/>
       </w:pPr>
@@ -777,6 +789,7 @@
     </w:p>
     <w:p>
       <w:pPr>
+        <w:keepNext/>
         <w:spacing w:after="0" w:before="0"/>
         <w:ind w:left="360"/>
       </w:pPr>
@@ -801,6 +814,7 @@
     </w:p>
     <w:p>
       <w:pPr>
+        <w:keepNext/>
         <w:spacing w:after="0" w:before="0"/>
         <w:ind w:left="360"/>
       </w:pPr>
@@ -825,6 +839,7 @@
     </w:p>
     <w:p>
       <w:pPr>
+        <w:keepNext/>
         <w:spacing w:after="0" w:before="0"/>
         <w:ind w:left="360"/>
       </w:pPr>
@@ -849,6 +864,7 @@
     </w:p>
     <w:p>
       <w:pPr>
+        <w:keepNext/>
         <w:spacing w:after="0" w:before="0"/>
         <w:ind w:left="360"/>
       </w:pPr>
@@ -873,6 +889,7 @@
     </w:p>
     <w:p>
       <w:pPr>
+        <w:keepNext/>
         <w:pBdr>
           <w:bottom w:val="single" w:color="1F3A5F" w:sz="8" w:space="4"/>
         </w:pBdr>
@@ -1624,6 +1641,7 @@
     </w:p>
     <w:p>
       <w:pPr>
+        <w:keepNext/>
         <w:spacing w:after="30" w:before="160"/>
       </w:pPr>
       <w:r>
@@ -1648,6 +1666,7 @@
     </w:p>
     <w:p>
       <w:pPr>
+        <w:keepNext/>
         <w:spacing w:after="0" w:before="0"/>
         <w:ind w:left="360"/>
       </w:pPr>
@@ -1672,6 +1691,7 @@
     </w:p>
     <w:p>
       <w:pPr>
+        <w:keepNext/>
         <w:spacing w:after="0" w:before="0"/>
         <w:ind w:left="360"/>
       </w:pPr>
@@ -1696,6 +1716,7 @@
     </w:p>
     <w:p>
       <w:pPr>
+        <w:keepNext/>
         <w:spacing w:after="0" w:before="0"/>
         <w:ind w:left="360"/>
       </w:pPr>
@@ -1720,6 +1741,7 @@
     </w:p>
     <w:p>
       <w:pPr>
+        <w:keepNext/>
         <w:spacing w:after="0" w:before="0"/>
         <w:ind w:left="360"/>
       </w:pPr>
@@ -1744,6 +1766,7 @@
     </w:p>
     <w:p>
       <w:pPr>
+        <w:keepNext/>
         <w:spacing w:after="0" w:before="0"/>
         <w:ind w:left="360"/>
       </w:pPr>
@@ -1768,6 +1791,7 @@
     </w:p>
     <w:p>
       <w:pPr>
+        <w:keepNext/>
         <w:spacing w:after="30" w:before="160"/>
       </w:pPr>
       <w:r>
@@ -1806,6 +1830,9 @@
         <w:gridCol w:w="9360"/>
       </w:tblGrid>
       <w:tr>
+        <w:trPr>
+          <w:cantSplit/>
+        </w:trPr>
         <w:tc>
           <w:tcPr>
             <w:tcW w:type="dxa" w:w="9360"/>
@@ -1868,6 +1895,7 @@
     </w:tbl>
     <w:p>
       <w:pPr>
+        <w:keepNext/>
         <w:spacing w:after="0" w:before="0"/>
         <w:ind w:left="360"/>
       </w:pPr>
@@ -1905,6 +1933,7 @@
     </w:p>
     <w:p>
       <w:pPr>
+        <w:keepNext/>
         <w:spacing w:after="0" w:before="0"/>
         <w:ind w:left="360"/>
       </w:pPr>
@@ -1942,6 +1971,7 @@
     </w:p>
     <w:p>
       <w:pPr>
+        <w:keepNext/>
         <w:spacing w:after="0" w:before="0"/>
         <w:ind w:left="360"/>
       </w:pPr>
@@ -1979,6 +2009,7 @@
     </w:p>
     <w:p>
       <w:pPr>
+        <w:keepNext/>
         <w:spacing w:after="0" w:before="0"/>
         <w:ind w:left="360"/>
       </w:pPr>
@@ -2016,6 +2047,7 @@
     </w:p>
     <w:p>
       <w:pPr>
+        <w:keepNext/>
         <w:pBdr>
           <w:bottom w:val="single" w:color="1F3A5F" w:sz="8" w:space="4"/>
         </w:pBdr>
@@ -2049,6 +2081,9 @@
         <w:gridCol w:w="9360"/>
       </w:tblGrid>
       <w:tr>
+        <w:trPr>
+          <w:cantSplit/>
+        </w:trPr>
         <w:tc>
           <w:tcPr>
             <w:tcW w:type="dxa" w:w="9360"/>
@@ -2308,6 +2343,7 @@
     </w:tbl>
     <w:p>
       <w:pPr>
+        <w:keepNext/>
         <w:spacing w:after="30" w:before="160"/>
       </w:pPr>
       <w:r>
@@ -2507,6 +2543,7 @@
     </w:p>
     <w:p>
       <w:pPr>
+        <w:keepNext/>
         <w:spacing w:after="30" w:before="160"/>
       </w:pPr>
       <w:r>
@@ -2531,6 +2568,7 @@
     </w:p>
     <w:p>
       <w:pPr>
+        <w:keepNext/>
         <w:spacing w:after="0" w:before="0"/>
         <w:ind w:left="360"/>
       </w:pPr>
@@ -2568,6 +2606,7 @@
     </w:p>
     <w:p>
       <w:pPr>
+        <w:keepNext/>
         <w:spacing w:after="0" w:before="0"/>
         <w:ind w:left="360"/>
       </w:pPr>
@@ -2605,6 +2644,7 @@
     </w:p>
     <w:p>
       <w:pPr>
+        <w:keepNext/>
         <w:spacing w:after="0" w:before="0"/>
         <w:ind w:left="360"/>
       </w:pPr>
@@ -2642,6 +2682,7 @@
     </w:p>
     <w:p>
       <w:pPr>
+        <w:keepNext/>
         <w:spacing w:after="0" w:before="0"/>
         <w:ind w:left="360"/>
       </w:pPr>
@@ -2679,6 +2720,7 @@
     </w:p>
     <w:p>
       <w:pPr>
+        <w:keepNext/>
         <w:spacing w:after="0" w:before="0"/>
         <w:ind w:left="360"/>
       </w:pPr>
@@ -2716,6 +2758,7 @@
     </w:p>
     <w:p>
       <w:pPr>
+        <w:keepNext/>
         <w:pBdr>
           <w:bottom w:val="single" w:color="1F3A5F" w:sz="8" w:space="4"/>
         </w:pBdr>
@@ -2749,6 +2792,9 @@
         <w:gridCol w:w="9360"/>
       </w:tblGrid>
       <w:tr>
+        <w:trPr>
+          <w:cantSplit/>
+        </w:trPr>
         <w:tc>
           <w:tcPr>
             <w:tcW w:type="dxa" w:w="9360"/>
@@ -2977,6 +3023,7 @@
     </w:tbl>
     <w:p>
       <w:pPr>
+        <w:keepNext/>
         <w:spacing w:after="30" w:before="160"/>
       </w:pPr>
       <w:r>
@@ -3001,6 +3048,7 @@
     </w:p>
     <w:p>
       <w:pPr>
+        <w:keepNext/>
         <w:spacing w:after="0" w:before="0"/>
         <w:ind w:left="360"/>
       </w:pPr>
@@ -3025,6 +3073,7 @@
     </w:p>
     <w:p>
       <w:pPr>
+        <w:keepNext/>
         <w:spacing w:after="0" w:before="0"/>
         <w:ind w:left="360"/>
       </w:pPr>
@@ -3049,6 +3098,7 @@
     </w:p>
     <w:p>
       <w:pPr>
+        <w:keepNext/>
         <w:spacing w:after="0" w:before="0"/>
         <w:ind w:left="360"/>
       </w:pPr>
@@ -3073,6 +3123,7 @@
     </w:p>
     <w:p>
       <w:pPr>
+        <w:keepNext/>
         <w:spacing w:after="0" w:before="0"/>
         <w:ind w:left="360"/>
       </w:pPr>
@@ -3097,6 +3148,7 @@
     </w:p>
     <w:p>
       <w:pPr>
+        <w:keepNext/>
         <w:spacing w:after="0" w:before="0"/>
         <w:ind w:left="360"/>
       </w:pPr>
@@ -3121,6 +3173,7 @@
     </w:p>
     <w:p>
       <w:pPr>
+        <w:keepNext/>
         <w:pBdr>
           <w:bottom w:val="single" w:color="1F3A5F" w:sz="8" w:space="4"/>
         </w:pBdr>
@@ -3140,6 +3193,7 @@
     </w:p>
     <w:p>
       <w:pPr>
+        <w:keepNext/>
         <w:spacing w:after="20" w:before="120"/>
       </w:pPr>
       <w:r>
@@ -3694,6 +3748,7 @@
     </w:tbl>
     <w:p>
       <w:pPr>
+        <w:keepNext/>
         <w:spacing w:after="30" w:before="160"/>
       </w:pPr>
       <w:r>
@@ -3718,6 +3773,7 @@
     </w:p>
     <w:p>
       <w:pPr>
+        <w:keepNext/>
         <w:spacing w:after="0" w:before="0"/>
         <w:ind w:left="360"/>
       </w:pPr>
@@ -3742,6 +3798,7 @@
     </w:p>
     <w:p>
       <w:pPr>
+        <w:keepNext/>
         <w:spacing w:after="0" w:before="0"/>
         <w:ind w:left="360"/>
       </w:pPr>
@@ -3766,6 +3823,7 @@
     </w:p>
     <w:p>
       <w:pPr>
+        <w:keepNext/>
         <w:spacing w:after="0" w:before="0"/>
         <w:ind w:left="360"/>
       </w:pPr>
@@ -3790,6 +3848,7 @@
     </w:p>
     <w:p>
       <w:pPr>
+        <w:keepNext/>
         <w:spacing w:after="0" w:before="0"/>
         <w:ind w:left="360"/>
       </w:pPr>
@@ -3814,6 +3873,7 @@
     </w:p>
     <w:p>
       <w:pPr>
+        <w:keepNext/>
         <w:spacing w:after="0" w:before="0"/>
         <w:ind w:left="360"/>
       </w:pPr>
@@ -3838,6 +3898,7 @@
     </w:p>
     <w:p>
       <w:pPr>
+        <w:keepNext/>
         <w:spacing w:after="20" w:before="120"/>
       </w:pPr>
       <w:r>
@@ -3868,6 +3929,9 @@
         <w:gridCol w:w="9360"/>
       </w:tblGrid>
       <w:tr>
+        <w:trPr>
+          <w:cantSplit/>
+        </w:trPr>
         <w:tc>
           <w:tcPr>
             <w:tcW w:type="dxa" w:w="9360"/>
@@ -4025,6 +4089,7 @@
     </w:tbl>
     <w:p>
       <w:pPr>
+        <w:keepNext/>
         <w:spacing w:after="30" w:before="160"/>
       </w:pPr>
       <w:r>
@@ -4049,6 +4114,7 @@
     </w:p>
     <w:p>
       <w:pPr>
+        <w:keepNext/>
         <w:spacing w:after="0" w:before="0"/>
         <w:ind w:left="360"/>
       </w:pPr>
@@ -4084,6 +4150,7 @@
     </w:p>
     <w:p>
       <w:pPr>
+        <w:keepNext/>
         <w:spacing w:after="0" w:before="0"/>
         <w:ind w:left="360"/>
       </w:pPr>
@@ -4119,6 +4186,7 @@
     </w:p>
     <w:p>
       <w:pPr>
+        <w:keepNext/>
         <w:spacing w:after="0" w:before="0"/>
         <w:ind w:left="360"/>
       </w:pPr>
@@ -4154,6 +4222,7 @@
     </w:p>
     <w:p>
       <w:pPr>
+        <w:keepNext/>
         <w:spacing w:after="0" w:before="0"/>
         <w:ind w:left="360"/>
       </w:pPr>
@@ -4189,6 +4258,7 @@
     </w:p>
     <w:p>
       <w:pPr>
+        <w:keepNext/>
         <w:spacing w:after="0" w:before="0"/>
         <w:ind w:left="360"/>
       </w:pPr>
@@ -4224,6 +4294,7 @@
     </w:p>
     <w:p>
       <w:pPr>
+        <w:keepNext/>
         <w:spacing w:after="20" w:before="120"/>
       </w:pPr>
       <w:r>
@@ -4515,6 +4586,7 @@
     </w:tbl>
     <w:p>
       <w:pPr>
+        <w:keepNext/>
         <w:spacing w:after="30" w:before="160"/>
       </w:pPr>
       <w:r>
@@ -4539,6 +4611,7 @@
     </w:p>
     <w:p>
       <w:pPr>
+        <w:keepNext/>
         <w:spacing w:after="0" w:before="0"/>
         <w:ind w:left="360"/>
       </w:pPr>
@@ -4563,6 +4636,7 @@
     </w:p>
     <w:p>
       <w:pPr>
+        <w:keepNext/>
         <w:spacing w:after="0" w:before="0"/>
         <w:ind w:left="360"/>
       </w:pPr>
@@ -4587,6 +4661,7 @@
     </w:p>
     <w:p>
       <w:pPr>
+        <w:keepNext/>
         <w:spacing w:after="0" w:before="0"/>
         <w:ind w:left="360"/>
       </w:pPr>
@@ -4611,6 +4686,7 @@
     </w:p>
     <w:p>
       <w:pPr>
+        <w:keepNext/>
         <w:spacing w:after="0" w:before="0"/>
         <w:ind w:left="360"/>
       </w:pPr>
@@ -4635,6 +4711,7 @@
     </w:p>
     <w:p>
       <w:pPr>
+        <w:keepNext/>
         <w:spacing w:after="0" w:before="0"/>
         <w:ind w:left="360"/>
       </w:pPr>
@@ -4659,6 +4736,7 @@
     </w:p>
     <w:p>
       <w:pPr>
+        <w:keepNext/>
         <w:spacing w:after="20" w:before="120"/>
       </w:pPr>
       <w:r>
@@ -4688,6 +4766,7 @@
     </w:p>
     <w:p>
       <w:pPr>
+        <w:keepNext/>
         <w:spacing w:after="0" w:before="0"/>
         <w:ind w:left="360"/>
       </w:pPr>
@@ -4712,6 +4791,7 @@
     </w:p>
     <w:p>
       <w:pPr>
+        <w:keepNext/>
         <w:spacing w:after="0" w:before="0"/>
         <w:ind w:left="360"/>
       </w:pPr>
@@ -4736,6 +4816,7 @@
     </w:p>
     <w:p>
       <w:pPr>
+        <w:keepNext/>
         <w:spacing w:after="0" w:before="0"/>
         <w:ind w:left="360"/>
       </w:pPr>
@@ -4760,6 +4841,7 @@
     </w:p>
     <w:p>
       <w:pPr>
+        <w:keepNext/>
         <w:spacing w:after="0" w:before="0"/>
         <w:ind w:left="360"/>
       </w:pPr>
@@ -4784,6 +4866,7 @@
     </w:p>
     <w:p>
       <w:pPr>
+        <w:keepNext/>
         <w:spacing w:after="0" w:before="0"/>
         <w:ind w:left="360"/>
       </w:pPr>

</xml_diff>

<commit_message>
Fix Exercise K: rename bonus, restore missing word boxes, fix keepNext
</commit_message>
<xml_diff>
--- a/Inter1_Test3_Reinforcement.docx
+++ b/Inter1_Test3_Reinforcement.docx
@@ -4613,6 +4613,23 @@
       <w:pPr>
         <w:keepNext/>
         <w:spacing w:after="0" w:before="0"/>
+      </w:pPr>
+      <w:r>
+        <w:rPr>
+          <w:rFonts w:ascii="Arial" w:cs="Arial" w:eastAsia="Arial" w:hAnsi="Arial"/>
+          <w:b/>
+          <w:bCs/>
+          <w:color w:val="1F3A5F"/>
+          <w:sz w:val="22"/>
+          <w:szCs w:val="22"/>
+        </w:rPr>
+        <w:t xml:space="preserve">melt  •  degree  •  weather  •  trap  •  wildfire</w:t>
+      </w:r>
+    </w:p>
+    <w:p>
+      <w:pPr>
+        <w:keepNext/>
+        <w:spacing w:after="0" w:before="0"/>
         <w:ind w:left="360"/>
       </w:pPr>
       <w:r>
@@ -4737,7 +4754,7 @@
     <w:p>
       <w:pPr>
         <w:keepNext/>
-        <w:spacing w:after="20" w:before="120"/>
+        <w:spacing w:after="30" w:before="160"/>
       </w:pPr>
       <w:r>
         <w:rPr>
@@ -4745,16 +4762,11 @@
           <w:b/>
           <w:bCs/>
           <w:color w:val="1F3A5F"/>
-          <w:sz w:val="24"/>
-          <w:szCs w:val="24"/>
-        </w:rPr>
-        <w:t xml:space="preserve">BONUS – Mixed Verbs</w:t>
-      </w:r>
-    </w:p>
-    <w:p>
-      <w:pPr>
-        <w:spacing w:after="0" w:before="0"/>
-      </w:pPr>
+          <w:sz w:val="23"/>
+          <w:szCs w:val="23"/>
+        </w:rPr>
+        <w:t xml:space="preserve">Exercise K – </w:t>
+      </w:r>
       <w:r>
         <w:rPr>
           <w:rFonts w:ascii="Arial" w:cs="Arial" w:eastAsia="Arial" w:hAnsi="Arial"/>
@@ -4762,6 +4774,23 @@
           <w:szCs w:val="22"/>
         </w:rPr>
         <w:t xml:space="preserve">Complete each sentence with the correct verb from the box.</w:t>
+      </w:r>
+    </w:p>
+    <w:p>
+      <w:pPr>
+        <w:keepNext/>
+        <w:spacing w:after="0" w:before="0"/>
+      </w:pPr>
+      <w:r>
+        <w:rPr>
+          <w:rFonts w:ascii="Arial" w:cs="Arial" w:eastAsia="Arial" w:hAnsi="Arial"/>
+          <w:b/>
+          <w:bCs/>
+          <w:color w:val="1F3A5F"/>
+          <w:sz w:val="22"/>
+          <w:szCs w:val="22"/>
+        </w:rPr>
+        <w:t xml:space="preserve">create  •  allow  •  reduce  •  provide  •  pay</w:t>
       </w:r>
     </w:p>
     <w:p>

</xml_diff>